<commit_message>
a lot of materials
prepping for IBM
</commit_message>
<xml_diff>
--- a/programming notebook.docx
+++ b/programming notebook.docx
@@ -46,15 +46,7 @@
     </w:p>
     <w:p>
       <w:r>
-        <w:t xml:space="preserve">Round decimal numbers to 4 </w:t>
-      </w:r>
-      <w:proofErr w:type="gramStart"/>
-      <w:r>
-        <w:t>digit</w:t>
-      </w:r>
-      <w:proofErr w:type="gramEnd"/>
-      <w:r>
-        <w:t xml:space="preserve">: </w:t>
+        <w:t xml:space="preserve">Round decimal numbers to 4 digit: </w:t>
       </w:r>
       <w:r>
         <w:drawing>
@@ -102,18 +94,18 @@
         <mc:AlternateContent>
           <mc:Choice Requires="wpi">
             <w:drawing>
-              <wp:anchor distT="0" distB="0" distL="114300" distR="114300" simplePos="0" relativeHeight="251674624" behindDoc="0" locked="0" layoutInCell="1" allowOverlap="1" wp14:anchorId="1018A873" wp14:editId="040F3483">
+              <wp:anchor distT="0" distB="0" distL="114300" distR="114300" simplePos="0" relativeHeight="251676672" behindDoc="0" locked="0" layoutInCell="1" allowOverlap="1" wp14:anchorId="6EA0710E" wp14:editId="5368C389">
                 <wp:simplePos x="0" y="0"/>
                 <wp:positionH relativeFrom="column">
-                  <wp:posOffset>426085</wp:posOffset>
+                  <wp:posOffset>1321132</wp:posOffset>
                 </wp:positionH>
                 <wp:positionV relativeFrom="paragraph">
-                  <wp:posOffset>301625</wp:posOffset>
+                  <wp:posOffset>254840</wp:posOffset>
                 </wp:positionV>
-                <wp:extent cx="572770" cy="447675"/>
-                <wp:effectExtent l="38100" t="38100" r="0" b="47625"/>
+                <wp:extent cx="1105200" cy="153000"/>
+                <wp:effectExtent l="57150" t="76200" r="19050" b="76200"/>
                 <wp:wrapNone/>
-                <wp:docPr id="1602789528" name="Ink 18"/>
+                <wp:docPr id="1353453497" name="Ink 20"/>
                 <wp:cNvGraphicFramePr/>
                 <a:graphic xmlns:a="http://schemas.openxmlformats.org/drawingml/2006/main">
                   <a:graphicData uri="http://schemas.microsoft.com/office/word/2010/wordprocessingInk">
@@ -123,7 +115,7 @@
                       </w14:nvContentPartPr>
                       <w14:xfrm>
                         <a:off x="0" y="0"/>
-                        <a:ext cx="572770" cy="447675"/>
+                        <a:ext cx="1105200" cy="153000"/>
                       </w14:xfrm>
                     </w14:contentPart>
                   </a:graphicData>
@@ -133,7 +125,7 @@
           </mc:Choice>
           <mc:Fallback>
             <w:pict>
-              <v:shapetype w14:anchorId="6A7F5CC7" id="_x0000_t75" coordsize="21600,21600" o:spt="75" o:preferrelative="t" path="m@4@5l@4@11@9@11@9@5xe" filled="f" stroked="f">
+              <v:shapetype w14:anchorId="1BAC41A1" id="_x0000_t75" coordsize="21600,21600" o:spt="75" o:preferrelative="t" path="m@4@5l@4@11@9@11@9@5xe" filled="f" stroked="f">
                 <v:stroke joinstyle="miter"/>
                 <v:formulas>
                   <v:f eqn="if lineDrawn pixelLineWidth 0"/>
@@ -152,8 +144,53 @@
                 <v:path o:extrusionok="f" gradientshapeok="t" o:connecttype="rect"/>
                 <o:lock v:ext="edit" aspectratio="t"/>
               </v:shapetype>
-              <v:shape id="Ink 18" o:spid="_x0000_s1026" type="#_x0000_t75" style="position:absolute;margin-left:33.05pt;margin-top:23.25pt;width:46.05pt;height:36.2pt;z-index:251674624;visibility:visible;mso-wrap-style:square;mso-wrap-distance-left:9pt;mso-wrap-distance-top:0;mso-wrap-distance-right:9pt;mso-wrap-distance-bottom:0;mso-position-horizontal:absolute;mso-position-horizontal-relative:text;mso-position-vertical:absolute;mso-position-vertical-relative:text" o:gfxdata="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">
+              <v:shape id="Ink 20" o:spid="_x0000_s1026" type="#_x0000_t75" style="position:absolute;margin-left:102.65pt;margin-top:17.2pt;width:89.85pt;height:17.75pt;z-index:251676672;visibility:visible;mso-wrap-style:square;mso-wrap-distance-left:9pt;mso-wrap-distance-top:0;mso-wrap-distance-right:9pt;mso-wrap-distance-bottom:0;mso-position-horizontal:absolute;mso-position-horizontal-relative:text;mso-position-vertical:absolute;mso-position-vertical-relative:text" o:gfxdata="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">
                 <v:imagedata r:id="rId7" o:title=""/>
+              </v:shape>
+            </w:pict>
+          </mc:Fallback>
+        </mc:AlternateContent>
+      </w:r>
+      <w:r>
+        <w:rPr>
+          <w:noProof/>
+        </w:rPr>
+        <mc:AlternateContent>
+          <mc:Choice Requires="wpi">
+            <w:drawing>
+              <wp:anchor distT="0" distB="0" distL="114300" distR="114300" simplePos="0" relativeHeight="251674624" behindDoc="0" locked="0" layoutInCell="1" allowOverlap="1" wp14:anchorId="1018A873" wp14:editId="040F3483">
+                <wp:simplePos x="0" y="0"/>
+                <wp:positionH relativeFrom="column">
+                  <wp:posOffset>426085</wp:posOffset>
+                </wp:positionH>
+                <wp:positionV relativeFrom="paragraph">
+                  <wp:posOffset>301625</wp:posOffset>
+                </wp:positionV>
+                <wp:extent cx="572770" cy="447675"/>
+                <wp:effectExtent l="38100" t="38100" r="0" b="47625"/>
+                <wp:wrapNone/>
+                <wp:docPr id="1602789528" name="Ink 18"/>
+                <wp:cNvGraphicFramePr/>
+                <a:graphic xmlns:a="http://schemas.openxmlformats.org/drawingml/2006/main">
+                  <a:graphicData uri="http://schemas.microsoft.com/office/word/2010/wordprocessingInk">
+                    <w14:contentPart bwMode="auto" r:id="rId8">
+                      <w14:nvContentPartPr>
+                        <w14:cNvContentPartPr/>
+                      </w14:nvContentPartPr>
+                      <w14:xfrm>
+                        <a:off x="0" y="0"/>
+                        <a:ext cx="572770" cy="447675"/>
+                      </w14:xfrm>
+                    </w14:contentPart>
+                  </a:graphicData>
+                </a:graphic>
+              </wp:anchor>
+            </w:drawing>
+          </mc:Choice>
+          <mc:Fallback>
+            <w:pict>
+              <v:shape w14:anchorId="247F12D6" id="Ink 18" o:spid="_x0000_s1026" type="#_x0000_t75" style="position:absolute;margin-left:33.05pt;margin-top:23.25pt;width:46.05pt;height:36.2pt;z-index:251674624;visibility:visible;mso-wrap-style:square;mso-wrap-distance-left:9pt;mso-wrap-distance-top:0;mso-wrap-distance-right:9pt;mso-wrap-distance-bottom:0;mso-position-horizontal:absolute;mso-position-horizontal-relative:text;mso-position-vertical:absolute;mso-position-vertical-relative:text" o:gfxdata="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">
+                <v:imagedata r:id="rId9" o:title=""/>
               </v:shape>
             </w:pict>
           </mc:Fallback>
@@ -181,7 +218,7 @@
                 <wp:cNvGraphicFramePr/>
                 <a:graphic xmlns:a="http://schemas.openxmlformats.org/drawingml/2006/main">
                   <a:graphicData uri="http://schemas.microsoft.com/office/word/2010/wordprocessingInk">
-                    <w14:contentPart bwMode="auto" r:id="rId8">
+                    <w14:contentPart bwMode="auto" r:id="rId10">
                       <w14:nvContentPartPr>
                         <w14:cNvContentPartPr/>
                       </w14:nvContentPartPr>
@@ -197,8 +234,8 @@
           </mc:Choice>
           <mc:Fallback>
             <w:pict>
-              <v:shape w14:anchorId="1814F131" id="Ink 1" o:spid="_x0000_s1026" type="#_x0000_t75" style="position:absolute;margin-left:13pt;margin-top:-.05pt;width:13.05pt;height:1.55pt;z-index:251659264;visibility:visible;mso-wrap-style:square;mso-wrap-distance-left:9pt;mso-wrap-distance-top:0;mso-wrap-distance-right:9pt;mso-wrap-distance-bottom:0;mso-position-horizontal:absolute;mso-position-horizontal-relative:text;mso-position-vertical:absolute;mso-position-vertical-relative:text" o:gfxdata="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">
-                <v:imagedata r:id="rId9" o:title=""/>
+              <v:shape w14:anchorId="610E0210" id="Ink 1" o:spid="_x0000_s1026" type="#_x0000_t75" style="position:absolute;margin-left:13pt;margin-top:-.05pt;width:13.05pt;height:1.5pt;z-index:251659264;visibility:visible;mso-wrap-style:square;mso-wrap-distance-left:9pt;mso-wrap-distance-top:0;mso-wrap-distance-right:9pt;mso-wrap-distance-bottom:0;mso-position-horizontal:absolute;mso-position-horizontal-relative:text;mso-position-vertical:absolute;mso-position-vertical-relative:text" o:gfxdata="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">
+                <v:imagedata r:id="rId11" o:title=""/>
               </v:shape>
             </w:pict>
           </mc:Fallback>
@@ -226,7 +263,7 @@
                 <wp:cNvGraphicFramePr/>
                 <a:graphic xmlns:a="http://schemas.openxmlformats.org/drawingml/2006/main">
                   <a:graphicData uri="http://schemas.microsoft.com/office/word/2010/wordprocessingInk">
-                    <w14:contentPart bwMode="auto" r:id="rId10">
+                    <w14:contentPart bwMode="auto" r:id="rId12">
                       <w14:nvContentPartPr>
                         <w14:cNvContentPartPr/>
                       </w14:nvContentPartPr>
@@ -242,8 +279,8 @@
           </mc:Choice>
           <mc:Fallback>
             <w:pict>
-              <v:shape w14:anchorId="7C02BEB3" id="Ink 2" o:spid="_x0000_s1026" type="#_x0000_t75" style="position:absolute;margin-left:12.9pt;margin-top:-.25pt;width:9.35pt;height:16.55pt;z-index:251660288;visibility:visible;mso-wrap-style:square;mso-wrap-distance-left:9pt;mso-wrap-distance-top:0;mso-wrap-distance-right:9pt;mso-wrap-distance-bottom:0;mso-position-horizontal:absolute;mso-position-horizontal-relative:text;mso-position-vertical:absolute;mso-position-vertical-relative:text" o:gfxdata="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">
-                <v:imagedata r:id="rId11" o:title=""/>
+              <v:shape w14:anchorId="6FBF8E85" id="Ink 2" o:spid="_x0000_s1026" type="#_x0000_t75" style="position:absolute;margin-left:12.9pt;margin-top:-.25pt;width:9.35pt;height:16.55pt;z-index:251660288;visibility:visible;mso-wrap-style:square;mso-wrap-distance-left:9pt;mso-wrap-distance-top:0;mso-wrap-distance-right:9pt;mso-wrap-distance-bottom:0;mso-position-horizontal:absolute;mso-position-horizontal-relative:text;mso-position-vertical:absolute;mso-position-vertical-relative:text" o:gfxdata="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">
+                <v:imagedata r:id="rId13" o:title=""/>
               </v:shape>
             </w:pict>
           </mc:Fallback>
@@ -271,7 +308,7 @@
                 <wp:cNvGraphicFramePr/>
                 <a:graphic xmlns:a="http://schemas.openxmlformats.org/drawingml/2006/main">
                   <a:graphicData uri="http://schemas.microsoft.com/office/word/2010/wordprocessingInk">
-                    <w14:contentPart bwMode="auto" r:id="rId12">
+                    <w14:contentPart bwMode="auto" r:id="rId14">
                       <w14:nvContentPartPr>
                         <w14:cNvContentPartPr/>
                       </w14:nvContentPartPr>
@@ -293,8 +330,8 @@
           </mc:Choice>
           <mc:Fallback>
             <w:pict>
-              <v:shape w14:anchorId="389945DC" id="Ink 10" o:spid="_x0000_s1026" type="#_x0000_t75" style="position:absolute;margin-left:40.8pt;margin-top:-2.95pt;width:21.7pt;height:13.3pt;z-index:251666432;visibility:visible;mso-wrap-style:square;mso-width-percent:0;mso-height-percent:0;mso-wrap-distance-left:9pt;mso-wrap-distance-top:0;mso-wrap-distance-right:9pt;mso-wrap-distance-bottom:0;mso-position-horizontal:absolute;mso-position-horizontal-relative:text;mso-position-vertical:absolute;mso-position-vertical-relative:text;mso-width-percent:0;mso-height-percent:0;mso-width-relative:margin;mso-height-relative:margin" o:gfxdata="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">
-                <v:imagedata r:id="rId13" o:title=""/>
+              <v:shape w14:anchorId="7E8B1BB1" id="Ink 10" o:spid="_x0000_s1026" type="#_x0000_t75" style="position:absolute;margin-left:40.8pt;margin-top:-2.95pt;width:21.7pt;height:13.3pt;z-index:251666432;visibility:visible;mso-wrap-style:square;mso-width-percent:0;mso-height-percent:0;mso-wrap-distance-left:9pt;mso-wrap-distance-top:0;mso-wrap-distance-right:9pt;mso-wrap-distance-bottom:0;mso-position-horizontal:absolute;mso-position-horizontal-relative:text;mso-position-vertical:absolute;mso-position-vertical-relative:text;mso-width-percent:0;mso-height-percent:0;mso-width-relative:margin;mso-height-relative:margin" o:gfxdata="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">
+                <v:imagedata r:id="rId15" o:title=""/>
               </v:shape>
             </w:pict>
           </mc:Fallback>
@@ -322,7 +359,7 @@
                 <wp:cNvGraphicFramePr/>
                 <a:graphic xmlns:a="http://schemas.openxmlformats.org/drawingml/2006/main">
                   <a:graphicData uri="http://schemas.microsoft.com/office/word/2010/wordprocessingInk">
-                    <w14:contentPart bwMode="auto" r:id="rId14">
+                    <w14:contentPart bwMode="auto" r:id="rId16">
                       <w14:nvContentPartPr>
                         <w14:cNvContentPartPr/>
                       </w14:nvContentPartPr>
@@ -338,8 +375,8 @@
           </mc:Choice>
           <mc:Fallback>
             <w:pict>
-              <v:shape w14:anchorId="2DDE6B3F" id="Ink 11" o:spid="_x0000_s1026" type="#_x0000_t75" style="position:absolute;margin-left:22.3pt;margin-top:-9.8pt;width:12.25pt;height:35.3pt;z-index:251667456;visibility:visible;mso-wrap-style:square;mso-wrap-distance-left:9pt;mso-wrap-distance-top:0;mso-wrap-distance-right:9pt;mso-wrap-distance-bottom:0;mso-position-horizontal:absolute;mso-position-horizontal-relative:text;mso-position-vertical:absolute;mso-position-vertical-relative:text" o:gfxdata="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">
-                <v:imagedata r:id="rId15" o:title=""/>
+              <v:shape w14:anchorId="3B05F778" id="Ink 11" o:spid="_x0000_s1026" type="#_x0000_t75" style="position:absolute;margin-left:22.3pt;margin-top:-9.8pt;width:12.25pt;height:35.3pt;z-index:251667456;visibility:visible;mso-wrap-style:square;mso-wrap-distance-left:9pt;mso-wrap-distance-top:0;mso-wrap-distance-right:9pt;mso-wrap-distance-bottom:0;mso-position-horizontal:absolute;mso-position-horizontal-relative:text;mso-position-vertical:absolute;mso-position-vertical-relative:text" o:gfxdata="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">
+                <v:imagedata r:id="rId17" o:title=""/>
               </v:shape>
             </w:pict>
           </mc:Fallback>
@@ -367,7 +404,7 @@
                 <wp:cNvGraphicFramePr/>
                 <a:graphic xmlns:a="http://schemas.openxmlformats.org/drawingml/2006/main">
                   <a:graphicData uri="http://schemas.microsoft.com/office/word/2010/wordprocessingInk">
-                    <w14:contentPart bwMode="auto" r:id="rId16">
+                    <w14:contentPart bwMode="auto" r:id="rId18">
                       <w14:nvContentPartPr>
                         <w14:cNvContentPartPr/>
                       </w14:nvContentPartPr>
@@ -383,8 +420,8 @@
           </mc:Choice>
           <mc:Fallback>
             <w:pict>
-              <v:shape w14:anchorId="70983789" id="Ink 12" o:spid="_x0000_s1026" type="#_x0000_t75" style="position:absolute;margin-left:69.35pt;margin-top:-12.45pt;width:13.9pt;height:40.1pt;z-index:251668480;visibility:visible;mso-wrap-style:square;mso-wrap-distance-left:9pt;mso-wrap-distance-top:0;mso-wrap-distance-right:9pt;mso-wrap-distance-bottom:0;mso-position-horizontal:absolute;mso-position-horizontal-relative:text;mso-position-vertical:absolute;mso-position-vertical-relative:text" o:gfxdata="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">
-                <v:imagedata r:id="rId17" o:title=""/>
+              <v:shape w14:anchorId="0E67D147" id="Ink 12" o:spid="_x0000_s1026" type="#_x0000_t75" style="position:absolute;margin-left:69.35pt;margin-top:-12.45pt;width:13.9pt;height:40.1pt;z-index:251668480;visibility:visible;mso-wrap-style:square;mso-wrap-distance-left:9pt;mso-wrap-distance-top:0;mso-wrap-distance-right:9pt;mso-wrap-distance-bottom:0;mso-position-horizontal:absolute;mso-position-horizontal-relative:text;mso-position-vertical:absolute;mso-position-vertical-relative:text" o:gfxdata="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">
+                <v:imagedata r:id="rId19" o:title=""/>
               </v:shape>
             </w:pict>
           </mc:Fallback>
@@ -412,7 +449,7 @@
                 <wp:cNvGraphicFramePr/>
                 <a:graphic xmlns:a="http://schemas.openxmlformats.org/drawingml/2006/main">
                   <a:graphicData uri="http://schemas.microsoft.com/office/word/2010/wordprocessingInk">
-                    <w14:contentPart bwMode="auto" r:id="rId18">
+                    <w14:contentPart bwMode="auto" r:id="rId20">
                       <w14:nvContentPartPr>
                         <w14:cNvContentPartPr/>
                       </w14:nvContentPartPr>
@@ -428,8 +465,8 @@
           </mc:Choice>
           <mc:Fallback>
             <w:pict>
-              <v:shape w14:anchorId="421BB9CD" id="Ink 13" o:spid="_x0000_s1026" type="#_x0000_t75" style="position:absolute;margin-left:80.9pt;margin-top:-4.3pt;width:6.35pt;height:13.95pt;z-index:251669504;visibility:visible;mso-wrap-style:square;mso-wrap-distance-left:9pt;mso-wrap-distance-top:0;mso-wrap-distance-right:9pt;mso-wrap-distance-bottom:0;mso-position-horizontal:absolute;mso-position-horizontal-relative:text;mso-position-vertical:absolute;mso-position-vertical-relative:text" o:gfxdata="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">
-                <v:imagedata r:id="rId19" o:title=""/>
+              <v:shape w14:anchorId="257515CC" id="Ink 13" o:spid="_x0000_s1026" type="#_x0000_t75" style="position:absolute;margin-left:80.9pt;margin-top:-4.3pt;width:6.35pt;height:13.95pt;z-index:251669504;visibility:visible;mso-wrap-style:square;mso-wrap-distance-left:9pt;mso-wrap-distance-top:0;mso-wrap-distance-right:9pt;mso-wrap-distance-bottom:0;mso-position-horizontal:absolute;mso-position-horizontal-relative:text;mso-position-vertical:absolute;mso-position-vertical-relative:text" o:gfxdata="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">
+                <v:imagedata r:id="rId21" o:title=""/>
               </v:shape>
             </w:pict>
           </mc:Fallback>
@@ -455,7 +492,7 @@
                     <pic:cNvPicPr/>
                   </pic:nvPicPr>
                   <pic:blipFill>
-                    <a:blip r:embed="rId20"/>
+                    <a:blip r:embed="rId22"/>
                     <a:stretch>
                       <a:fillRect/>
                     </a:stretch>
@@ -476,7 +513,53 @@
         </w:drawing>
       </w:r>
     </w:p>
-    <w:p/>
+    <w:p>
+      <w:r>
+        <w:rPr>
+          <w:noProof/>
+        </w:rPr>
+        <mc:AlternateContent>
+          <mc:Choice Requires="wpi">
+            <w:drawing>
+              <wp:anchor distT="0" distB="0" distL="114300" distR="114300" simplePos="0" relativeHeight="251675648" behindDoc="0" locked="0" layoutInCell="1" allowOverlap="1" wp14:anchorId="7353D992" wp14:editId="4DBDC8A1">
+                <wp:simplePos x="0" y="0"/>
+                <wp:positionH relativeFrom="column">
+                  <wp:posOffset>640732</wp:posOffset>
+                </wp:positionH>
+                <wp:positionV relativeFrom="paragraph">
+                  <wp:posOffset>9190</wp:posOffset>
+                </wp:positionV>
+                <wp:extent cx="177480" cy="159120"/>
+                <wp:effectExtent l="57150" t="76200" r="32385" b="88900"/>
+                <wp:wrapNone/>
+                <wp:docPr id="52991956" name="Ink 19"/>
+                <wp:cNvGraphicFramePr/>
+                <a:graphic xmlns:a="http://schemas.openxmlformats.org/drawingml/2006/main">
+                  <a:graphicData uri="http://schemas.microsoft.com/office/word/2010/wordprocessingInk">
+                    <w14:contentPart bwMode="auto" r:id="rId23">
+                      <w14:nvContentPartPr>
+                        <w14:cNvContentPartPr/>
+                      </w14:nvContentPartPr>
+                      <w14:xfrm>
+                        <a:off x="0" y="0"/>
+                        <a:ext cx="177480" cy="159120"/>
+                      </w14:xfrm>
+                    </w14:contentPart>
+                  </a:graphicData>
+                </a:graphic>
+              </wp:anchor>
+            </w:drawing>
+          </mc:Choice>
+          <mc:Fallback>
+            <w:pict>
+              <v:shape w14:anchorId="783DD6CD" id="Ink 19" o:spid="_x0000_s1026" type="#_x0000_t75" style="position:absolute;margin-left:49.05pt;margin-top:-2.15pt;width:16.8pt;height:18.25pt;z-index:251675648;visibility:visible;mso-wrap-style:square;mso-wrap-distance-left:9pt;mso-wrap-distance-top:0;mso-wrap-distance-right:9pt;mso-wrap-distance-bottom:0;mso-position-horizontal:absolute;mso-position-horizontal-relative:text;mso-position-vertical:absolute;mso-position-vertical-relative:text" o:gfxdata="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">
+                <v:imagedata r:id="rId24" o:title=""/>
+              </v:shape>
+            </w:pict>
+          </mc:Fallback>
+        </mc:AlternateContent>
+      </w:r>
+    </w:p>
     <w:p/>
     <w:p/>
     <w:p/>
@@ -1423,6 +1506,35 @@
         <inkml:traceFormat>
           <inkml:channel name="X" type="integer" min="-2.14748E9" max="2.14748E9" units="cm"/>
           <inkml:channel name="Y" type="integer" min="-2.14748E9" max="2.14748E9" units="cm"/>
+        </inkml:traceFormat>
+        <inkml:channelProperties>
+          <inkml:channelProperty channel="X" name="resolution" value="1000" units="1/cm"/>
+          <inkml:channelProperty channel="Y" name="resolution" value="1000" units="1/cm"/>
+        </inkml:channelProperties>
+      </inkml:inkSource>
+      <inkml:timestamp xml:id="ts0" timeString="2025-04-07T02:05:50.622"/>
+    </inkml:context>
+    <inkml:brush xml:id="br0">
+      <inkml:brushProperty name="width" value="0.1" units="cm"/>
+      <inkml:brushProperty name="height" value="0.2" units="cm"/>
+      <inkml:brushProperty name="color" value="#FFFC00"/>
+      <inkml:brushProperty name="tip" value="rectangle"/>
+      <inkml:brushProperty name="rasterOp" value="maskPen"/>
+      <inkml:brushProperty name="ignorePressure" value="1"/>
+    </inkml:brush>
+  </inkml:definitions>
+  <inkml:trace contextRef="#ctx0" brushRef="#br0">29 159,'32'0,"0"2,1 1,-1 1,41 11,-34-5,1-2,75 4,-114-12,50 5,57 2,-6 1,-70-4,4-2,50-3,29 2,-42 11,-53-7,1-1,37 1,74 9,-89-14,2 0,0-2,50-7,-43-1,-21 3,0 2,63-3,595 8,-571-13,15 0,-78 15,-37 0,-1-1,1 0,0-1,0-2,0 1,-1-2,21-5,-35 6,1 1,0-1,-1 0,1 1,-1-2,0 1,1 0,-1-1,0 1,0-1,-1 0,1 0,0 0,-1-1,0 1,0 0,0-1,0 1,1-5,-3 5,1 0,-1 1,0-1,0 0,0 1,0-1,-1 0,1 1,-1-1,1 1,-1-1,0 1,0-1,0 1,-1-1,1 1,0 0,-1 0,0-1,1 1,-1 0,0 1,0-1,0 0,0 0,0 1,-1 0,1-1,-4-1,-1 0,-1 0,0 1,0 0,0 0,0 0,0 1,0 0,0 1,0 0,-10 1,6 0,0-2,-1 1,-18-4,-75-23,77 19,0 1,0 1,-1 1,0 2,1 1,-1 1,0 2,0 1,-30 6,4-3,-1-2,-68-6,19 1,86 2,-26-1,-89 12,7 6,-58 10,93-8,1 1,-147-8,192-12,-19 1,-99-12,124 7,0 2,-55 5,48-1,-56-4,56-4,-50-2,84 8,6 0,0 0,0 0,0 1,0 0,-13 4,19-5,0 1,0 0,0 0,1 0,-1 0,0 0,1 0,-1 1,1-1,-1 0,1 1,0-1,-1 1,1 0,0-1,0 1,0 0,0 0,0 0,1-1,-1 1,1 0,-1 0,1 0,-1 0,1 0,0 4,0 1,1 1,-1-1,1 1,1-1,-1 0,1 1,1-1,-1 0,1 0,0 0,1-1,0 1,0-1,0 0,1 0,0 0,0-1,0 1,1-1,-1-1,1 1,1-1,-1 0,0 0,1-1,0 0,0 0,0 0,0-1,0 0,9 1,37 7,0-3,93 2,290-9,-415 1,0 2,34 7,-34-6,0 0,39 1,71 9,-44-16,118 4,-160 4,28 1,-49-6,-1 1,35 8,-35-5,1-2,36 2,139-19,-67 1,-112 11,0 0,0-1,-1 0,24-9,33-6,70 5,-94 7,55-1,-22 0,-50 2,26 4,-52 2,1-1,0 0,-1 0,1-1,0 0,-1-1,1 0,-1 0,0-1,14-6,-22 9,0 0,0-1,0 1,0-1,0 1,-1-1,1 0,0 1,0-1,0 0,-1 0,1 1,0-1,-1 0,1 0,-1 0,1 0,-1 0,0 0,1 0,-1 0,0 0,1 0,-1 0,0 0,0 0,0-2,-1 2,1-1,-1 0,0 0,0 1,0-1,0 0,0 1,0-1,-1 1,1-1,0 1,-1 0,-2-2,-7-5,0 1,-1 0,-15-5,23 10,-27-14,-58-41,47 28,37 25,-9-5,0-1,-1 1,0 1,0 1,-1 0,-32-9,9 7,0 1,-1 2,-62-1,18 5,-70 4,85 11,54-9,-1-1,1 0,-29 1,-141 8,-424-12,593-1,1 0,-1-2,-21-5,22 4,0 0,-1 2,-26-2,-90-9,-490 14,504 13,85-11,-49 12,76-14,0 1,0 0,0 0,0 1,1 0,-1 0,1 0,-1 1,1-1,0 1,1 1,-1-1,1 0,0 1,0 0,0 0,0 1,1-1,-4 10,4-8,1 0,0 0,1 1,-1-1,1 1,1-1,0 1,0 0,0-1,1 1,0-1,0 1,1-1,0 0,0 1,5 8,-6-13,0 1,1-1,-1 1,1-1,-1 1,1-1,0 0,1 0,-1 0,0 0,1 0,0 0,0-1,0 1,0-1,0 0,0 0,0 0,1 0,-1-1,1 1,-1-1,1 0,0 0,-1 0,1-1,4 1,4 2,25 7,1-1,0-2,1-1,47 0,73 8,344-15,-371 15,979-15,-992-12,-104 12,0-1,0-1,0 0,25-8,-24 6,-1 0,1 2,0 0,19-1,111-9,-133 13,-1 0</inkml:trace>
+</inkml:ink>
+</file>
+
+<file path=word/ink/ink2.xml><?xml version="1.0" encoding="utf-8"?>
+<inkml:ink xmlns:inkml="http://www.w3.org/2003/InkML">
+  <inkml:definitions>
+    <inkml:context xml:id="ctx0">
+      <inkml:inkSource xml:id="inkSrc0">
+        <inkml:traceFormat>
+          <inkml:channel name="X" type="integer" min="-2.14748E9" max="2.14748E9" units="cm"/>
+          <inkml:channel name="Y" type="integer" min="-2.14748E9" max="2.14748E9" units="cm"/>
           <inkml:channel name="F" type="integer" max="32767" units="dev"/>
         </inkml:traceFormat>
         <inkml:channelProperties>
@@ -1441,12 +1553,12 @@
   </inkml:definitions>
   <inkml:trace contextRef="#ctx0" brushRef="#br0">252 42 24575,'4'0'0,"0"-1"0,0 0 0,0 0 0,-1 0 0,1-1 0,0 1 0,0-1 0,-1 0 0,1 0 0,5-4 0,-5 3 0,1 0 0,-1 1 0,0-1 0,1 1 0,-1 0 0,1 1 0,-1-1 0,7 0 0,3 0 0,0 2 0,1 0 0,-1 0 0,16 4 0,-28-4 0,1 0 0,-1 1 0,0-1 0,0 1 0,0 0 0,1 0 0,-1 0 0,0 0 0,0 0 0,0 0 0,0 0 0,-1 1 0,1-1 0,3 4 0,-5-4 0,1 0 0,-1 1 0,1-1 0,-1 0 0,0 1 0,1-1 0,-1 0 0,0 1 0,0-1 0,0 1 0,0-1 0,0 0 0,-1 1 0,1-1 0,0 1 0,-1-1 0,1 0 0,0 0 0,-1 1 0,0-1 0,1 0 0,-1 0 0,0 1 0,0-1 0,1 0 0,-1 0 0,-2 1 0,-1 3 0,-1 0 0,0 0 0,0-1 0,0 0 0,0 0 0,-1 0 0,0-1 0,-9 5 0,9-5 0,-1 0 0,1 1 0,0 0 0,0 0 0,-10 10 0,16-14 0,0 0 0,-1 0 0,1 1 0,0-1 0,0 0 0,0 1 0,-1-1 0,1 0 0,0 1 0,0-1 0,0 0 0,0 1 0,0-1 0,0 0 0,0 1 0,0-1 0,0 1 0,0-1 0,0 0 0,0 1 0,0-1 0,0 0 0,0 1 0,0-1 0,0 1 0,0-1 0,0 0 0,0 1 0,1-1 0,-1 0 0,0 1 0,0-1 0,0 0 0,1 0 0,-1 1 0,0-1 0,1 1 0,18 10 0,21 2 0,-37-12 0,1 0 0,0 0 0,0 1 0,-1-1 0,1 1 0,-1 0 0,1 0 0,-1 0 0,0 1 0,1-1 0,-1 1 0,-1 0 0,1 0 0,0 0 0,3 5 0,-5-6 0,0-1 0,0 1 0,-1 0 0,1 0 0,-1-1 0,1 1 0,-1 0 0,0 0 0,0 0 0,1-1 0,-1 1 0,0 0 0,-1 0 0,1 0 0,0-1 0,-1 1 0,1 0 0,-1 0 0,1-1 0,-1 1 0,0 0 0,1-1 0,-1 1 0,0 0 0,0-1 0,0 0 0,-1 1 0,1-1 0,0 1 0,0-1 0,-1 0 0,1 0 0,-1 0 0,1 0 0,-1 0 0,-1 1 0,-20 11 0,1 0 0,-2-1 0,0-2 0,0 0 0,-36 8 0,21-5-1365,29-11-5461</inkml:trace>
   <inkml:trace contextRef="#ctx0" brushRef="#br0" timeOffset="1108.21">780 54 24575,'65'-13'0,"-35"11"0,47 0 0,-72 2 0,0 1 0,0-1 0,0 1 0,0 0 0,-1 0 0,1 0 0,0 1 0,-1 0 0,1 0 0,-1 0 0,8 5 0,-9-4 0,0-1 0,-1 1 0,1 1 0,-1-1 0,1 0 0,-1 1 0,0-1 0,-1 1 0,1-1 0,-1 1 0,1 0 0,-1 0 0,0-1 0,0 1 0,-1 0 0,1 0 0,-1 0 0,0 0 0,0 0 0,0 0 0,-1 0 0,1 0 0,-1 0 0,0 0 0,0 0 0,-1 0 0,1-1 0,-1 1 0,1 0 0,-1-1 0,0 0 0,-1 1 0,1-1 0,0 0 0,-1 0 0,0 0 0,0 0 0,0-1 0,0 1 0,0-1 0,0 1 0,-1-1 0,1 0 0,-7 2 0,-10 5 0,10-3 0,0-1 0,-1-1 0,1 0 0,-1 0 0,-21 3 0,29-7 0,0 0 0,0 0 0,-1 0 0,1 0 0,0 0 0,0-1 0,0 0 0,0 0 0,0 0 0,0 0 0,0 0 0,1 0 0,-1-1 0,0 1 0,0-1 0,1 0 0,-1 0 0,1 0 0,0 0 0,0 0 0,-1 0 0,1-1 0,1 1 0,-1-1 0,0 1 0,-1-5 0,-2-1 0,0 0 0,1-1 0,1 1 0,-1-1 0,1 0 0,1 0 0,-3-16 0,4 21 0,1 0 0,0 0 0,0 0 0,0 0 0,1 0 0,0 0 0,-1 0 0,1 0 0,1 0 0,-1 0 0,1 0 0,-1 1 0,1-1 0,0 1 0,0-1 0,0 1 0,1 0 0,-1 0 0,1 0 0,4-4 0,9-8-1365,-8 9-5461</inkml:trace>
-  <inkml:trace contextRef="#ctx0" brushRef="#br0" timeOffset="2215.22">0 568 24575,'186'13'0,"-93"-5"0,-41-1 0,54 6 0,-47 0 0,-48-10 0,0 0 0,0-1 0,0 0 0,18 1 0,90 11 0,-13-1 0,-29-1 0,-55-7 0,1-2 0,41 3 0,30-5 0,76-3 0,15-25 0,-137 20 0,-39 4 0,1 1 0,0 1 0,0 0 0,1 0 0,-1 1 0,0 0 0,0 1 0,18 3 0,-27-4-23,-1 0 1,0 0-1,0 0 0,1 0 0,-1 0 1,0 0-1,0 0 0,1 0 0,-1 0 1,0 0-1,0 0 0,0 0 0,1 1 1,-1-1-1,0 0 0,0 0 0,0 0 1,1 0-1,-1 0 0,0 1 0,0-1 1,0 0-1,0 0 0,1 0 0,-1 1 1,0-1-1,0 0 0,0 0 0,0 1 1,0-1-1,0 0 0,0 0 0,0 0 1,0 1-1,0-1 0,0 0 0,1 0 1,-1 1-1,-1-1 0,1 0 0,0 0 1,0 1-1,0-1 0,0 0 0,0 0 1,0 1-1,0-1 0,0 0 0,0 0 0,0 0 1,0 1-1,-1-1 0,1 0 0,0 0 1,0 0-1,0 1 0,0-1 0,-1 0 1,1 0-1</inkml:trace>
+  <inkml:trace contextRef="#ctx0" brushRef="#br0" timeOffset="2215.21">0 568 24575,'186'13'0,"-93"-5"0,-41-1 0,54 6 0,-47 0 0,-48-10 0,0 0 0,0-1 0,0 0 0,18 1 0,90 11 0,-13-1 0,-29-1 0,-55-7 0,1-2 0,41 3 0,30-5 0,76-3 0,15-25 0,-137 20 0,-39 4 0,1 1 0,0 1 0,0 0 0,1 0 0,-1 1 0,0 0 0,0 1 0,18 3 0,-27-4-23,-1 0 1,0 0-1,0 0 0,1 0 0,-1 0 1,0 0-1,0 0 0,1 0 0,-1 0 1,0 0-1,0 0 0,0 0 0,1 1 1,-1-1-1,0 0 0,0 0 0,0 0 1,1 0-1,-1 0 0,0 1 0,0-1 1,0 0-1,0 0 0,1 0 0,-1 1 1,0-1-1,0 0 0,0 0 0,0 1 1,0-1-1,0 0 0,0 0 0,0 0 1,0 1-1,0-1 0,0 0 0,1 0 1,-1 1-1,-1-1 0,1 0 0,0 0 1,0 1-1,0-1 0,0 0 0,0 0 1,0 1-1,0-1 0,0 0 0,0 0 0,0 0 1,0 1-1,-1-1 0,1 0 0,0 0 1,0 0-1,0 1 0,0-1 0,-1 0 1,1 0-1</inkml:trace>
   <inkml:trace contextRef="#ctx0" brushRef="#br0" timeOffset="3617.46">754 847 24575,'65'-1'0,"69"2"0,-132-1 0,-1 0 0,0 0 0,0 0 0,0 0 0,0 0 0,0 0 0,1 1 0,-1-1 0,0 0 0,0 1 0,0-1 0,0 1 0,0-1 0,0 1 0,0-1 0,0 1 0,0 0 0,0 0 0,0-1 0,-1 1 0,1 0 0,0 0 0,0 0 0,-1 0 0,1 0 0,0 0 0,-1 0 0,1 0 0,0 2 0,-1-1 0,0 1 0,0-1 0,-1 1 0,1-1 0,0 1 0,-1-1 0,0 1 0,1-1 0,-1 0 0,0 1 0,0-1 0,-3 4 0,-3 6 0,0-2 0,-1 1 0,-1-1 0,-9 10 0,12-15 0,1 1 0,0-1 0,-1 0 0,1 0 0,-1-1 0,0 1 0,0-1 0,-1-1 0,1 1 0,-1-1 0,-12 4 0,19-7 0,0 0 0,0 0 0,0 0 0,0 0 0,-1 0 0,1 0 0,0 0 0,0 0 0,0 0 0,0 0 0,0 0 0,0 0 0,0 0 0,-1 0 0,1 1 0,0-1 0,0 0 0,0 0 0,0 0 0,0 0 0,0 0 0,0 0 0,0 0 0,0 0 0,0 0 0,0 0 0,-1 1 0,1-1 0,0 0 0,0 0 0,0 0 0,0 0 0,0 0 0,0 0 0,0 0 0,0 1 0,0-1 0,0 0 0,0 0 0,0 0 0,0 0 0,0 0 0,0 0 0,0 0 0,0 1 0,0-1 0,0 0 0,0 0 0,1 0 0,-1 0 0,0 0 0,0 0 0,0 0 0,0 1 0,0-1 0,0 0 0,0 0 0,0 0 0,0 0 0,0 0 0,0 0 0,1 0 0,-1 0 0,12 8 0,19 5 0,-28-12 0,4 2 0,2 0 0,0 1 0,0 0 0,-1 0 0,15 10 0,-22-13 0,0 0 0,0-1 0,0 1 0,0 0 0,0 0 0,-1 0 0,1 0 0,0 0 0,-1 0 0,1 0 0,0 0 0,-1 0 0,0 0 0,1 0 0,-1 0 0,0 0 0,1 0 0,-1 1 0,0 0 0,0 0 0,-1-1 0,1 1 0,-1-1 0,1 1 0,-1-1 0,0 0 0,1 1 0,-1-1 0,0 0 0,0 0 0,0 1 0,0-1 0,0 0 0,0 0 0,0 0 0,-1 0 0,1 0 0,-3 1 0,-5 4 0,-90 68 0,94-70-85,1 0 0,-1-1-1,0 1 1,0-1 0,0 0-1,0 0 1,-1 0 0,1-1-1,-1 0 1,1 0 0,-1 0-1,0-1 1,0 0 0,0 0-1,-7 0 1,2 0-6741</inkml:trace>
 </inkml:ink>
 </file>
 
-<file path=word/ink/ink2.xml><?xml version="1.0" encoding="utf-8"?>
+<file path=word/ink/ink3.xml><?xml version="1.0" encoding="utf-8"?>
 <inkml:ink xmlns:inkml="http://www.w3.org/2003/InkML">
   <inkml:definitions>
     <inkml:context xml:id="ctx0">
@@ -1474,7 +1586,7 @@
 </inkml:ink>
 </file>
 
-<file path=word/ink/ink3.xml><?xml version="1.0" encoding="utf-8"?>
+<file path=word/ink/ink4.xml><?xml version="1.0" encoding="utf-8"?>
 <inkml:ink xmlns:inkml="http://www.w3.org/2003/InkML">
   <inkml:definitions>
     <inkml:context xml:id="ctx0">
@@ -1502,7 +1614,7 @@
 </inkml:ink>
 </file>
 
-<file path=word/ink/ink4.xml><?xml version="1.0" encoding="utf-8"?>
+<file path=word/ink/ink5.xml><?xml version="1.0" encoding="utf-8"?>
 <inkml:ink xmlns:inkml="http://www.w3.org/2003/InkML">
   <inkml:definitions>
     <inkml:context xml:id="ctx0">
@@ -1531,7 +1643,7 @@
 </inkml:ink>
 </file>
 
-<file path=word/ink/ink5.xml><?xml version="1.0" encoding="utf-8"?>
+<file path=word/ink/ink6.xml><?xml version="1.0" encoding="utf-8"?>
 <inkml:ink xmlns:inkml="http://www.w3.org/2003/InkML">
   <inkml:definitions>
     <inkml:context xml:id="ctx0">
@@ -1559,7 +1671,7 @@
 </inkml:ink>
 </file>
 
-<file path=word/ink/ink6.xml><?xml version="1.0" encoding="utf-8"?>
+<file path=word/ink/ink7.xml><?xml version="1.0" encoding="utf-8"?>
 <inkml:ink xmlns:inkml="http://www.w3.org/2003/InkML">
   <inkml:definitions>
     <inkml:context xml:id="ctx0">
@@ -1587,7 +1699,7 @@
 </inkml:ink>
 </file>
 
-<file path=word/ink/ink7.xml><?xml version="1.0" encoding="utf-8"?>
+<file path=word/ink/ink8.xml><?xml version="1.0" encoding="utf-8"?>
 <inkml:ink xmlns:inkml="http://www.w3.org/2003/InkML">
   <inkml:definitions>
     <inkml:context xml:id="ctx0">
@@ -1612,6 +1724,35 @@
     </inkml:brush>
   </inkml:definitions>
   <inkml:trace contextRef="#ctx0" brushRef="#br0">174 1 24575,'-1'5'0,"0"1"0,-1-1 0,1 1 0,-1-1 0,0 0 0,-1 1 0,1-1 0,-1 0 0,0-1 0,0 1 0,0 0 0,-1-1 0,0 0 0,0 0 0,-7 6 0,-25 33 0,4 6 0,26-41 0,0 0 0,0 1 0,0 0 0,1 0 0,1 0 0,-1 0 0,2 1 0,-1-1 0,1 1 0,1 0 0,0 0 0,0 1 0,0 9 0,2-14 0,0-1 0,0 1 0,0-1 0,1 1 0,0-1 0,0 1 0,1-1 0,-1 0 0,1 1 0,0-1 0,1 0 0,-1 0 0,1-1 0,0 1 0,0 0 0,1-1 0,-1 0 0,1 0 0,0 0 0,0 0 0,0-1 0,1 1 0,-1-1 0,1 0 0,0 0 0,0-1 0,0 0 0,0 1 0,10 1 0,-10-2 0,-1 0 0,1-1 0,0 1 0,0-1 0,0-1 0,0 1 0,0-1 0,0 1 0,0-2 0,5 1 0,-8-1 0,0 0 0,0 0 0,0 0 0,0 0 0,-1-1 0,1 1 0,0 0 0,-1-1 0,1 1 0,-1-1 0,0 0 0,1 1 0,-1-1 0,0 0 0,0 0 0,0 0 0,0 0 0,0 0 0,-1 0 0,1 0 0,-1 0 0,1 0 0,-1 0 0,0 0 0,1 0 0,-1-3 0,1-4 0,0 0 0,0 0 0,-1-1 0,0 1 0,0 0 0,-3-12 0,2 18 0,1 1 0,-1 0 0,0 0 0,1 0 0,-1 0 0,0 0 0,-1 0 0,1 0 0,0 0 0,-1 0 0,1 0 0,-1 0 0,1 1 0,-1-1 0,0 1 0,1-1 0,-1 1 0,0 0 0,0-1 0,0 1 0,0 0 0,0 1 0,-1-1 0,1 0 0,0 0 0,0 1 0,-1-1 0,1 1 0,-4 0 0,-100-13-1365,94 13-5461</inkml:trace>
+</inkml:ink>
+</file>
+
+<file path=word/ink/ink9.xml><?xml version="1.0" encoding="utf-8"?>
+<inkml:ink xmlns:inkml="http://www.w3.org/2003/InkML">
+  <inkml:definitions>
+    <inkml:context xml:id="ctx0">
+      <inkml:inkSource xml:id="inkSrc0">
+        <inkml:traceFormat>
+          <inkml:channel name="X" type="integer" min="-2.14748E9" max="2.14748E9" units="cm"/>
+          <inkml:channel name="Y" type="integer" min="-2.14748E9" max="2.14748E9" units="cm"/>
+        </inkml:traceFormat>
+        <inkml:channelProperties>
+          <inkml:channelProperty channel="X" name="resolution" value="1000" units="1/cm"/>
+          <inkml:channelProperty channel="Y" name="resolution" value="1000" units="1/cm"/>
+        </inkml:channelProperties>
+      </inkml:inkSource>
+      <inkml:timestamp xml:id="ts0" timeString="2025-04-07T02:05:44.117"/>
+    </inkml:context>
+    <inkml:brush xml:id="br0">
+      <inkml:brushProperty name="width" value="0.1" units="cm"/>
+      <inkml:brushProperty name="height" value="0.2" units="cm"/>
+      <inkml:brushProperty name="color" value="#FFFC00"/>
+      <inkml:brushProperty name="tip" value="rectangle"/>
+      <inkml:brushProperty name="rasterOp" value="maskPen"/>
+      <inkml:brushProperty name="ignorePressure" value="1"/>
+    </inkml:brush>
+  </inkml:definitions>
+  <inkml:trace contextRef="#ctx0" brushRef="#br0">1 81,'62'-2,"-39"0,-1 1,1 1,-1 1,1 1,22 5,-34-2,-1 0,-1 0,1 1,-1 0,0 1,0 0,12 13,-2-2,-14-13,-1 0,0 1,0 0,0 0,-1 0,0 0,0 1,0-1,-1 1,0 0,-1 0,1-1,0 12,0 2,-1 1,0 0,-4 26,3-43,-1 0,0-1,-1 0,1 1,-1-1,1 0,-1 1,0-1,0 0,-1-1,1 1,-1 0,1-1,-1 1,0-1,0 0,0 1,0-1,0-1,0 1,-1-1,1 1,0-1,-1 0,1 0,-1 0,0-1,1 1,-7-1,5 1,-1 0,1-1,-1 0,1 0,-1 0,0-1,1 0,-1 0,1 0,0-1,-1 0,1 0,0 0,0 0,0-1,0 0,1 0,-9-7,-9-16,7 10,1-2,-22-34,32 44,0-1,0 0,1 0,0 0,0 0,1 0,1 0,0-1,-1-18,2 21,0-1,0 1,1-1,0 1,1 0,-1-1,1 1,1 0,-1 0,6-11,-5 14,1 0,-1 0,1 0,-1 0,1 1,0 0,0 0,0 0,1 0,-1 0,1 1,0 0,0 0,-1 0,1 0,7 0,148-37,-158 37,1 1,-1 1,1-1,0 0,-1 1,1-1,0 1,-1 0,1 0,0 0,-1 0,1 0,0 0,0 1,-1 0,1-1,-1 1,1 0,-1 0,1 0,-1 1,0-1,1 1,-1-1,0 1,0 0,0-1,0 1,0 0,-1 1,1-1,0 0,-1 0,0 1,1-1,-1 1,0-1,-1 1,1-1,0 1,-1-1,1 1,-1 0,0 0,0-1,0 6,0 0,0 0,0 0,-1 0,-1 0,1 0,-1 0,0 0,-1 0,0-1,0 1,-1-1,0 0,0 0,0 0,-7 6,7-8,-1-1,-1 0,1-1,0 1,-1-1,0 0,0 0,0-1,0 0,0 0,-13 3,-22 6,20 0,18-10,0 1,1 0,-1-1,0 0,0 0,0 0,0 0,0 0,-5 0,7-1,0-1,0 1,0 0,0-1,0 0,0 1,0-1,0 0,0 1,0-1,0 0,0 0,0 0,1 0,-1 0,0 0,1 0,-1 0,1 0,-1 0,1 0,-1 0,1 0,0 0,0 0,-1-1,1 1,0 0,0 0,0 0,1-3,-4-12,2-1,0 1,0-1,2 0,0 1,1-1,6-22,-7 36,0 1,0-1,1 1,-1-1,1 1,0 0,0 0,0-1,0 1,0 1,0-1,0 0,1 0,-1 1,1-1,-1 1,1 0,0 0,-1 0,1 0,0 0,0 1,-1-1,1 1,0 0,0 0,0 0,0 0,0 0,-1 1,1-1,0 1,0 0,0-1,-1 1,1 1,-1-1,1 0,-1 1,1-1,-1 1,0 0,1 0,-1 0,0 0,0 0,-1 0,1 0,0 1,-1-1,1 1,-1-1,0 1,0-1,0 1,1 3,4 10,-1 0,0 0,-1 0,-1 1,-1-1,1 31,-3-37,-1-1,1 0,-2 1,0-1,0 0,-4 13,5-20,0-1,1 1,-1 0,0 0,0-1,0 1,0 0,0-1,0 1,-1-1,1 0,0 1,-1-1,1 0,-1 0,1 0,-1 0,0 0,0 0,1 0,-1-1,0 1,0-1,0 1,0-1,1 1,-1-1,0 0,0 0,0 0,0 0,0-1,0 1,0 0,0-1,1 1,-1-1,-3-1,3 0,0 0,0 1,1-1,-1 0,0 0,1 0,0 0,-1 0,1 0,0 0,0-1,0 1,0 0,1-1,-1 1,1 0,-1-1,1 1,0-1,0 1,0-1,0-3,7-56,-4 55,0 0,0 0,1 1,0 0,0 0,0 0,1 0,0 0,10-8,0 0,1 1,23-14,-20 15,-8 4,1 0,0 2,0-1,0 1,14-4,-25 10,0 0,0 0,0 0,0 0,0 0,0 0,1 1,-1-1,0 0,0 0,0 1,0-1,0 1,-1-1,1 1,0-1,0 1,0 0,0-1,0 1,-1 0,1 0,0-1,-1 1,1 0,-1 0,1 0,-1 0,1 0,-1 0,1 0,-1 0,0 0,0 0,1 0,-1 0,0 0,0 0,0 0,0 0,0 2,-1 55,0-45,1 10,0-11,0-1,0 1,-1-1,-1 1,-3 12,4-22,0 1,0-1,0 0,0 1,0-1,0 0,-1 0,1 0,-1 0,1 0,-1 0,0 0,0-1,0 1,0-1,0 1,0-1,0 0,0 0,-1 0,1 0,0 0,-1 0,1-1,-1 1,1-1,-1 1,1-1,-3 0,-195 11,184-11,8 1,0-1,0 0,1 0,-1-1,0 0,1-1,-11-3,17 5,-1-1,1 1,0-1,0 0,0 0,0 1,0-1,0 0,0 0,0 0,1 0,-1 0,0 0,0 0,1-1,-1 1,1 0,-1 0,0-3,1 1,0 0,0 0,0 0,0 0,0 0,1 0,-1 0,1 0,0 0,0 0,3-5,2-1,1 0,0 0,0 1,1 0,0 1,16-13,-17 15,-4 2,1 1,-1-1,1 1,0 0,0 0,0 0,0 0,0 1,0-1,0 1,1 0,-1 0,0 1,8-1,-10 2,0-1,0 0,-1 1,1-1,0 1,0 0,0-1,-1 1,1 0,0 0,-1 0,1 0,-1 1,0-1,1 0,-1 1,0-1,1 1,-1-1,0 1,0-1,0 1,-1 0,1-1,0 1,-1 0,1 0,-1 0,1 0,-1-1,0 1,0 0,0 0,0 4,5 32,-4-31,1 0,-1 0,-1 0,1 0,-1 0,-2 14,2-20,-1 1,0 0,0 0,0 0,0 0,0-1,0 1,0 0,0-1,-1 1,1-1,-1 1,1-1,-1 0,0 0,1 1,-1-1,0-1,0 1,1 0,-1 0,0 0,0-1,0 0,0 1,0-1,0 0,0 0,-3 0,-2 1,-1 0,1 0,-1-1,1 0,-1-1,-14-3,21 4,-1-1,0 0,0 0,1 0,-1 0,0 0,1 0,-1-1,1 1,-1 0,1-1,0 1,-1-1,1 0,0 1,0-1,0 0,1 0,-1 1,0-1,1 0,-1 0,1 0,-1 0,1 0,0 0,0 0,0 0,0 0,0-2,0 2,4-31,-4 32,0 0,0 0,1 0,-1 0,0 0,1 1,-1-1,1 0,-1 0,1 0,-1 1,1-1,0 0,-1 1,1-1,0 0,0 1,-1-1,1 1,0-1,0 1,0 0,0-1,-1 1,1 0,0 0,0-1,0 1,0 0,0 0,1 0,5 1</inkml:trace>
 </inkml:ink>
 </file>
 

</xml_diff>